<commit_message>
realControlPerson={     'name':'深圳市翰宸控股有限公司',     'humanName':'刘莲娇', } 的企业及分页
</commit_message>
<xml_diff>
--- a/jj易教何子全python/project/20260318/1_填充后.docx
+++ b/jj易教何子全python/project/20260318/1_填充后.docx
@@ -2630,7 +2630,7 @@
               <w:rPr>
                 <w:rFonts w:ascii="宋体" w:hAnsi="宋体" w:eastAsia="宋体"/>
               </w:rPr>
-              <w:t>深圳市恒荣投资发展有限公司</w:t>
+              <w:t>深圳市前海一方实业咨询有限公司</w:t>
             </w:r>
           </w:p>
         </w:tc>
@@ -2643,7 +2643,7 @@
               <w:rPr>
                 <w:rFonts w:ascii="宋体" w:hAnsi="宋体" w:eastAsia="宋体"/>
               </w:rPr>
-              <w:t>实际控制人关系亲密的家庭成员控制的公司</w:t>
+              <w:t>实际控制人控制的公司</w:t>
             </w:r>
           </w:p>
         </w:tc>
@@ -2658,7 +2658,7 @@
               <w:rPr>
                 <w:rFonts w:ascii="宋体" w:hAnsi="宋体" w:eastAsia="宋体"/>
               </w:rPr>
-              <w:t>深圳市煌壹商业管理有限公司</w:t>
+              <w:t>深圳市前海一方恒融商业保理有限公司</w:t>
             </w:r>
           </w:p>
         </w:tc>
@@ -2671,7 +2671,7 @@
               <w:rPr>
                 <w:rFonts w:ascii="宋体" w:hAnsi="宋体" w:eastAsia="宋体"/>
               </w:rPr>
-              <w:t>实际控制人关系亲密的家庭成员控制的公司</w:t>
+              <w:t>实际控制人控制的公司</w:t>
             </w:r>
           </w:p>
         </w:tc>
@@ -2686,7 +2686,7 @@
               <w:rPr>
                 <w:rFonts w:ascii="宋体" w:hAnsi="宋体" w:eastAsia="宋体"/>
               </w:rPr>
-              <w:t>深圳市壹豆咖啡餐饮管理有限公司</w:t>
+              <w:t>洋奕（深圳）投资管理有限公司</w:t>
             </w:r>
           </w:p>
         </w:tc>
@@ -2699,7 +2699,7 @@
               <w:rPr>
                 <w:rFonts w:ascii="宋体" w:hAnsi="宋体" w:eastAsia="宋体"/>
               </w:rPr>
-              <w:t>实际控制人关系亲密的家庭成员控制的公司</w:t>
+              <w:t>实际控制人控制的公司</w:t>
             </w:r>
           </w:p>
         </w:tc>
@@ -2714,7 +2714,7 @@
               <w:rPr>
                 <w:rFonts w:ascii="宋体" w:hAnsi="宋体" w:eastAsia="宋体"/>
               </w:rPr>
-              <w:t>深圳市煌壹投资有限公司</w:t>
+              <w:t>深圳市一方融合咨询管理有限公司</w:t>
             </w:r>
           </w:p>
         </w:tc>
@@ -2727,7 +2727,7 @@
               <w:rPr>
                 <w:rFonts w:ascii="宋体" w:hAnsi="宋体" w:eastAsia="宋体"/>
               </w:rPr>
-              <w:t>实际控制人关系亲密的家庭成员控制的公司</w:t>
+              <w:t>实际控制人控制的公司</w:t>
             </w:r>
           </w:p>
         </w:tc>
@@ -2742,7 +2742,7 @@
               <w:rPr>
                 <w:rFonts w:ascii="宋体" w:hAnsi="宋体" w:eastAsia="宋体"/>
               </w:rPr>
-              <w:t>东莞煌壹置地有限公司</w:t>
+              <w:t>深圳市前海一方科技研发集团有限公司</w:t>
             </w:r>
           </w:p>
         </w:tc>
@@ -2755,7 +2755,7 @@
               <w:rPr>
                 <w:rFonts w:ascii="宋体" w:hAnsi="宋体" w:eastAsia="宋体"/>
               </w:rPr>
-              <w:t>实际控制人关系亲密的家庭成员控制的公司</w:t>
+              <w:t>实际控制人控制的公司</w:t>
             </w:r>
           </w:p>
         </w:tc>
@@ -2770,7 +2770,7 @@
               <w:rPr>
                 <w:rFonts w:ascii="宋体" w:hAnsi="宋体" w:eastAsia="宋体"/>
               </w:rPr>
-              <w:t>烨疆置地（深圳）有限公司</w:t>
+              <w:t>北京一方商业保理有限公司</w:t>
             </w:r>
           </w:p>
         </w:tc>
@@ -2783,7 +2783,7 @@
               <w:rPr>
                 <w:rFonts w:ascii="宋体" w:hAnsi="宋体" w:eastAsia="宋体"/>
               </w:rPr>
-              <w:t>实际控制人关系亲密的家庭成员控制的公司</w:t>
+              <w:t>实际控制人控制的公司</w:t>
             </w:r>
           </w:p>
         </w:tc>
@@ -2798,7 +2798,7 @@
               <w:rPr>
                 <w:rFonts w:ascii="宋体" w:hAnsi="宋体" w:eastAsia="宋体"/>
               </w:rPr>
-              <w:t>东莞力冠置地有限公司</w:t>
+              <w:t>深圳市佑荣信息科技有限公司</w:t>
             </w:r>
           </w:p>
         </w:tc>
@@ -2811,7 +2811,7 @@
               <w:rPr>
                 <w:rFonts w:ascii="宋体" w:hAnsi="宋体" w:eastAsia="宋体"/>
               </w:rPr>
-              <w:t>实际控制人关系亲密的家庭成员控制的公司</w:t>
+              <w:t>实际控制人控制的公司</w:t>
             </w:r>
           </w:p>
         </w:tc>
@@ -2826,7 +2826,7 @@
               <w:rPr>
                 <w:rFonts w:ascii="宋体" w:hAnsi="宋体" w:eastAsia="宋体"/>
               </w:rPr>
-              <w:t>烨疆置地（东莞）有限公司</w:t>
+              <w:t>深圳市程远一方企业总部管理有限公司</w:t>
             </w:r>
           </w:p>
         </w:tc>
@@ -2839,7 +2839,7 @@
               <w:rPr>
                 <w:rFonts w:ascii="宋体" w:hAnsi="宋体" w:eastAsia="宋体"/>
               </w:rPr>
-              <w:t>实际控制人关系亲密的家庭成员控制的公司</w:t>
+              <w:t>实际控制人控制的公司</w:t>
             </w:r>
           </w:p>
         </w:tc>
@@ -2854,7 +2854,7 @@
               <w:rPr>
                 <w:rFonts w:ascii="宋体" w:hAnsi="宋体" w:eastAsia="宋体"/>
               </w:rPr>
-              <w:t>东莞悦嵘置业有限公司</w:t>
+              <w:t>深圳市前海顺易一方控股有限公司</w:t>
             </w:r>
           </w:p>
         </w:tc>
@@ -2867,7 +2867,7 @@
               <w:rPr>
                 <w:rFonts w:ascii="宋体" w:hAnsi="宋体" w:eastAsia="宋体"/>
               </w:rPr>
-              <w:t>实际控制人关系亲密的家庭成员控制的公司</w:t>
+              <w:t>实际控制人控制的公司</w:t>
             </w:r>
           </w:p>
         </w:tc>
@@ -2882,7 +2882,7 @@
               <w:rPr>
                 <w:rFonts w:ascii="宋体" w:hAnsi="宋体" w:eastAsia="宋体"/>
               </w:rPr>
-              <w:t>东莞腾振城市建设有限公司</w:t>
+              <w:t>深圳市一方保成科技有限公司</w:t>
             </w:r>
           </w:p>
         </w:tc>
@@ -2895,7 +2895,7 @@
               <w:rPr>
                 <w:rFonts w:ascii="宋体" w:hAnsi="宋体" w:eastAsia="宋体"/>
               </w:rPr>
-              <w:t>实际控制人关系亲密的家庭成员控制的公司</w:t>
+              <w:t>实际控制人控制的公司</w:t>
             </w:r>
           </w:p>
         </w:tc>
@@ -2910,7 +2910,7 @@
               <w:rPr>
                 <w:rFonts w:ascii="宋体" w:hAnsi="宋体" w:eastAsia="宋体"/>
               </w:rPr>
-              <w:t>东莞惠盈城市建设有限公司</w:t>
+              <w:t>深圳市赢盛畅发商贸有限公司</w:t>
             </w:r>
           </w:p>
         </w:tc>
@@ -2923,7 +2923,7 @@
               <w:rPr>
                 <w:rFonts w:ascii="宋体" w:hAnsi="宋体" w:eastAsia="宋体"/>
               </w:rPr>
-              <w:t>实际控制人关系亲密的家庭成员控制的公司</w:t>
+              <w:t>实际控制人控制的公司</w:t>
             </w:r>
           </w:p>
         </w:tc>
@@ -2938,7 +2938,7 @@
               <w:rPr>
                 <w:rFonts w:ascii="宋体" w:hAnsi="宋体" w:eastAsia="宋体"/>
               </w:rPr>
-              <w:t>东莞屹嵘置业有限公司</w:t>
+              <w:t>深圳市创灵贸易有限公司</w:t>
             </w:r>
           </w:p>
         </w:tc>
@@ -2951,7 +2951,7 @@
               <w:rPr>
                 <w:rFonts w:ascii="宋体" w:hAnsi="宋体" w:eastAsia="宋体"/>
               </w:rPr>
-              <w:t>实际控制人关系亲密的家庭成员控制的公司</w:t>
+              <w:t>实际控制人控制的公司</w:t>
             </w:r>
           </w:p>
         </w:tc>
@@ -2966,7 +2966,7 @@
               <w:rPr>
                 <w:rFonts w:ascii="宋体" w:hAnsi="宋体" w:eastAsia="宋体"/>
               </w:rPr>
-              <w:t>东莞裕建城市建设有限公司</w:t>
+              <w:t>深圳市碧源咨询有限责任公司</w:t>
             </w:r>
           </w:p>
         </w:tc>
@@ -2979,7 +2979,7 @@
               <w:rPr>
                 <w:rFonts w:ascii="宋体" w:hAnsi="宋体" w:eastAsia="宋体"/>
               </w:rPr>
-              <w:t>实际控制人关系亲密的家庭成员控制的公司</w:t>
+              <w:t>实际控制人控制的公司</w:t>
             </w:r>
           </w:p>
         </w:tc>
@@ -2994,7 +2994,7 @@
               <w:rPr>
                 <w:rFonts w:ascii="宋体" w:hAnsi="宋体" w:eastAsia="宋体"/>
               </w:rPr>
-              <w:t>深圳中兴实业股份有限公司</w:t>
+              <w:t>深圳市快联供应链管理有限公司</w:t>
             </w:r>
           </w:p>
         </w:tc>
@@ -3007,7 +3007,7 @@
               <w:rPr>
                 <w:rFonts w:ascii="宋体" w:hAnsi="宋体" w:eastAsia="宋体"/>
               </w:rPr>
-              <w:t>实际控制人关系亲密的家庭成员控制的公司</w:t>
+              <w:t>实际控制人控制的公司</w:t>
             </w:r>
           </w:p>
         </w:tc>
@@ -3022,7 +3022,7 @@
               <w:rPr>
                 <w:rFonts w:ascii="宋体" w:hAnsi="宋体" w:eastAsia="宋体"/>
               </w:rPr>
-              <w:t>深圳市霖梓投资发展有限公司</w:t>
+              <w:t>成都思致科技有限公司</w:t>
             </w:r>
           </w:p>
         </w:tc>
@@ -3035,7 +3035,7 @@
               <w:rPr>
                 <w:rFonts w:ascii="宋体" w:hAnsi="宋体" w:eastAsia="宋体"/>
               </w:rPr>
-              <w:t>实际控制人关系亲密的家庭成员控制的公司</w:t>
+              <w:t>实际控制人控制的公司</w:t>
             </w:r>
           </w:p>
         </w:tc>
@@ -3050,7 +3050,7 @@
               <w:rPr>
                 <w:rFonts w:ascii="宋体" w:hAnsi="宋体" w:eastAsia="宋体"/>
               </w:rPr>
-              <w:t>前海一方（大连）石油化工有限公司</w:t>
+              <w:t>深圳市赢盛数字科技有限公司</w:t>
             </w:r>
           </w:p>
         </w:tc>
@@ -3063,7 +3063,7 @@
               <w:rPr>
                 <w:rFonts w:ascii="宋体" w:hAnsi="宋体" w:eastAsia="宋体"/>
               </w:rPr>
-              <w:t>实际控制人关系亲密的家庭成员控制的公司</w:t>
+              <w:t>实际控制人控制的公司</w:t>
             </w:r>
           </w:p>
         </w:tc>
@@ -3078,7 +3078,7 @@
               <w:rPr>
                 <w:rFonts w:ascii="宋体" w:hAnsi="宋体" w:eastAsia="宋体"/>
               </w:rPr>
-              <w:t>深圳市前海一方供应链管理有限公司</w:t>
+              <w:t>深圳市琳珠凯粤投资有限公司</w:t>
             </w:r>
           </w:p>
         </w:tc>
@@ -3091,7 +3091,7 @@
               <w:rPr>
                 <w:rFonts w:ascii="宋体" w:hAnsi="宋体" w:eastAsia="宋体"/>
               </w:rPr>
-              <w:t>实际控制人关系亲密的家庭成员控制的公司</w:t>
+              <w:t>实际控制人控制的公司</w:t>
             </w:r>
           </w:p>
         </w:tc>
@@ -3106,7 +3106,7 @@
               <w:rPr>
                 <w:rFonts w:ascii="宋体" w:hAnsi="宋体" w:eastAsia="宋体"/>
               </w:rPr>
-              <w:t>唐山市唐城物业服务有限公司</w:t>
+              <w:t>深圳市添浩供应链管理有限公司</w:t>
             </w:r>
           </w:p>
         </w:tc>
@@ -3119,7 +3119,7 @@
               <w:rPr>
                 <w:rFonts w:ascii="宋体" w:hAnsi="宋体" w:eastAsia="宋体"/>
               </w:rPr>
-              <w:t>实际控制人关系亲密的家庭成员控制的公司</w:t>
+              <w:t>实际控制人控制的公司</w:t>
             </w:r>
           </w:p>
         </w:tc>
@@ -3134,7 +3134,7 @@
               <w:rPr>
                 <w:rFonts w:ascii="宋体" w:hAnsi="宋体" w:eastAsia="宋体"/>
               </w:rPr>
-              <w:t>深圳市华丽商贸物流有限公司</w:t>
+              <w:t>成都恒融供应链管理有限公司</w:t>
             </w:r>
           </w:p>
         </w:tc>
@@ -3147,7 +3147,7 @@
               <w:rPr>
                 <w:rFonts w:ascii="宋体" w:hAnsi="宋体" w:eastAsia="宋体"/>
               </w:rPr>
-              <w:t>实际控制人关系亲密的家庭成员控制的公司</w:t>
+              <w:t>实际控制人控制的公司</w:t>
             </w:r>
           </w:p>
         </w:tc>
@@ -3162,7 +3162,7 @@
               <w:rPr>
                 <w:rFonts w:ascii="宋体" w:hAnsi="宋体" w:eastAsia="宋体"/>
               </w:rPr>
-              <w:t>深圳市前海东火科技有限公司</w:t>
+              <w:t>深圳市稳诚一方数字科技服务有限公司</w:t>
             </w:r>
           </w:p>
         </w:tc>
@@ -3175,7 +3175,7 @@
               <w:rPr>
                 <w:rFonts w:ascii="宋体" w:hAnsi="宋体" w:eastAsia="宋体"/>
               </w:rPr>
-              <w:t>实际控制人关系亲密的家庭成员控制的公司</w:t>
+              <w:t>实际控制人控制的公司</w:t>
             </w:r>
           </w:p>
         </w:tc>
@@ -3190,7 +3190,7 @@
               <w:rPr>
                 <w:rFonts w:ascii="宋体" w:hAnsi="宋体" w:eastAsia="宋体"/>
               </w:rPr>
-              <w:t>深圳市前海小东投资有限公司</w:t>
+              <w:t>深圳市赢盛数科创业投资合伙企业（有限合伙）</w:t>
             </w:r>
           </w:p>
         </w:tc>
@@ -3203,7 +3203,7 @@
               <w:rPr>
                 <w:rFonts w:ascii="宋体" w:hAnsi="宋体" w:eastAsia="宋体"/>
               </w:rPr>
-              <w:t>实际控制人关系亲密的家庭成员控制的公司</w:t>
+              <w:t>实际控制人控制的公司</w:t>
             </w:r>
           </w:p>
         </w:tc>
@@ -3218,7 +3218,7 @@
               <w:rPr>
                 <w:rFonts w:ascii="宋体" w:hAnsi="宋体" w:eastAsia="宋体"/>
               </w:rPr>
-              <w:t>深圳市光昱商贸有限公司</w:t>
+              <w:t>深圳市源远创业合伙企业（有限合伙）</w:t>
             </w:r>
           </w:p>
         </w:tc>
@@ -3231,7 +3231,7 @@
               <w:rPr>
                 <w:rFonts w:ascii="宋体" w:hAnsi="宋体" w:eastAsia="宋体"/>
               </w:rPr>
-              <w:t>实际控制人关系亲密的家庭成员控制的公司</w:t>
+              <w:t>实际控制人控制的公司</w:t>
             </w:r>
           </w:p>
         </w:tc>
@@ -3246,7 +3246,7 @@
               <w:rPr>
                 <w:rFonts w:ascii="宋体" w:hAnsi="宋体" w:eastAsia="宋体"/>
               </w:rPr>
-              <w:t>深圳市恒荣物业服务有限公司</w:t>
+              <w:t>北海稳诚一方科技服务有限公司</w:t>
             </w:r>
           </w:p>
         </w:tc>
@@ -3259,7 +3259,7 @@
               <w:rPr>
                 <w:rFonts w:ascii="宋体" w:hAnsi="宋体" w:eastAsia="宋体"/>
               </w:rPr>
-              <w:t>实际控制人关系亲密的家庭成员控制的公司</w:t>
+              <w:t>实际控制人控制的公司</w:t>
             </w:r>
           </w:p>
         </w:tc>
@@ -3274,7 +3274,7 @@
               <w:rPr>
                 <w:rFonts w:ascii="宋体" w:hAnsi="宋体" w:eastAsia="宋体"/>
               </w:rPr>
-              <w:t>深圳市中兴资产管理有限公司</w:t>
+              <w:t>豆方数科（深圳）有限责任公司</w:t>
             </w:r>
           </w:p>
         </w:tc>
@@ -3287,7 +3287,7 @@
               <w:rPr>
                 <w:rFonts w:ascii="宋体" w:hAnsi="宋体" w:eastAsia="宋体"/>
               </w:rPr>
-              <w:t>实际控制人关系亲密的家庭成员控制的公司</w:t>
+              <w:t>实际控制人控制的公司</w:t>
             </w:r>
           </w:p>
         </w:tc>
@@ -3302,7 +3302,7 @@
               <w:rPr>
                 <w:rFonts w:ascii="宋体" w:hAnsi="宋体" w:eastAsia="宋体"/>
               </w:rPr>
-              <w:t>深圳市丰阳供应链有限公司</w:t>
+              <w:t>深圳市方荣企业管理有限公司</w:t>
             </w:r>
           </w:p>
         </w:tc>
@@ -3315,7 +3315,7 @@
               <w:rPr>
                 <w:rFonts w:ascii="宋体" w:hAnsi="宋体" w:eastAsia="宋体"/>
               </w:rPr>
-              <w:t>实际控制人关系亲密的家庭成员控制的公司</w:t>
+              <w:t>实际控制人控制的公司</w:t>
             </w:r>
           </w:p>
         </w:tc>
@@ -3330,7 +3330,7 @@
               <w:rPr>
                 <w:rFonts w:ascii="宋体" w:hAnsi="宋体" w:eastAsia="宋体"/>
               </w:rPr>
-              <w:t>深圳市一方华丽投资顾问企业（有限合伙）</w:t>
+              <w:t>江苏华美一方供应链数字科技有限公司</w:t>
             </w:r>
           </w:p>
         </w:tc>
@@ -3343,7 +3343,7 @@
               <w:rPr>
                 <w:rFonts w:ascii="宋体" w:hAnsi="宋体" w:eastAsia="宋体"/>
               </w:rPr>
-              <w:t>实际控制人关系亲密的家庭成员控制的公司</w:t>
+              <w:t>实际控制人控制的公司</w:t>
             </w:r>
           </w:p>
         </w:tc>
@@ -3358,7 +3358,7 @@
               <w:rPr>
                 <w:rFonts w:ascii="宋体" w:hAnsi="宋体" w:eastAsia="宋体"/>
               </w:rPr>
-              <w:t>深圳市中投恒星贸易有限公司</w:t>
+              <w:t>深圳市元旸科技有限公司</w:t>
             </w:r>
           </w:p>
         </w:tc>
@@ -3371,7 +3371,7 @@
               <w:rPr>
                 <w:rFonts w:ascii="宋体" w:hAnsi="宋体" w:eastAsia="宋体"/>
               </w:rPr>
-              <w:t>实际控制人关系亲密的家庭成员控制的公司</w:t>
+              <w:t>实际控制人控制的公司</w:t>
             </w:r>
           </w:p>
         </w:tc>
@@ -3386,7 +3386,7 @@
               <w:rPr>
                 <w:rFonts w:ascii="宋体" w:hAnsi="宋体" w:eastAsia="宋体"/>
               </w:rPr>
-              <w:t>深圳市方扬咨询合伙企业（有限合伙）</w:t>
+              <w:t>泉州市元旸科技有限公司</w:t>
             </w:r>
           </w:p>
         </w:tc>
@@ -3399,7 +3399,7 @@
               <w:rPr>
                 <w:rFonts w:ascii="宋体" w:hAnsi="宋体" w:eastAsia="宋体"/>
               </w:rPr>
-              <w:t>实际控制人关系亲密的家庭成员控制的公司</w:t>
+              <w:t>实际控制人控制的公司</w:t>
             </w:r>
           </w:p>
         </w:tc>
@@ -3414,7 +3414,7 @@
               <w:rPr>
                 <w:rFonts w:ascii="宋体" w:hAnsi="宋体" w:eastAsia="宋体"/>
               </w:rPr>
-              <w:t>成都市一方明茂供应链管理有限公司</w:t>
+              <w:t>深圳市翰宸控股有限公司</w:t>
             </w:r>
           </w:p>
         </w:tc>
@@ -3427,7 +3427,7 @@
               <w:rPr>
                 <w:rFonts w:ascii="宋体" w:hAnsi="宋体" w:eastAsia="宋体"/>
               </w:rPr>
-              <w:t>实际控制人关系亲密的家庭成员控制的公司</w:t>
+              <w:t>实际控制人控制的公司</w:t>
             </w:r>
           </w:p>
         </w:tc>
@@ -3442,7 +3442,7 @@
               <w:rPr>
                 <w:rFonts w:ascii="宋体" w:hAnsi="宋体" w:eastAsia="宋体"/>
               </w:rPr>
-              <w:t>深圳中兴实业股份有限公司中兴工业城停车场</w:t>
+              <w:t>深圳市景尚总部企业管理有限公司</w:t>
             </w:r>
           </w:p>
         </w:tc>
@@ -3455,7 +3455,7 @@
               <w:rPr>
                 <w:rFonts w:ascii="宋体" w:hAnsi="宋体" w:eastAsia="宋体"/>
               </w:rPr>
-              <w:t>实际控制人关系亲密的家庭成员控制的公司</w:t>
+              <w:t>实际控制人控制的公司</w:t>
             </w:r>
           </w:p>
         </w:tc>
@@ -3470,7 +3470,7 @@
               <w:rPr>
                 <w:rFonts w:ascii="宋体" w:hAnsi="宋体" w:eastAsia="宋体"/>
               </w:rPr>
-              <w:t>深圳龙岗三立电气制造公司</w:t>
+              <w:t>广州市荣元圣科技有限公司</w:t>
             </w:r>
           </w:p>
         </w:tc>
@@ -3483,7 +3483,7 @@
               <w:rPr>
                 <w:rFonts w:ascii="宋体" w:hAnsi="宋体" w:eastAsia="宋体"/>
               </w:rPr>
-              <w:t>实际控制人关系亲密的家庭成员控制的公司</w:t>
+              <w:t>实际控制人控制的公司</w:t>
             </w:r>
           </w:p>
         </w:tc>
@@ -3498,7 +3498,7 @@
               <w:rPr>
                 <w:rFonts w:ascii="宋体" w:hAnsi="宋体" w:eastAsia="宋体"/>
               </w:rPr>
-              <w:t>深圳市丽扬咨询合伙企业（有限合伙）</w:t>
+              <w:t>深圳市银链一方数字科技有限公司</w:t>
             </w:r>
           </w:p>
         </w:tc>
@@ -3511,7 +3511,7 @@
               <w:rPr>
                 <w:rFonts w:ascii="宋体" w:hAnsi="宋体" w:eastAsia="宋体"/>
               </w:rPr>
-              <w:t>实际控制人关系亲密的家庭成员控制的公司</w:t>
+              <w:t>实际控制人控制的公司</w:t>
             </w:r>
           </w:p>
         </w:tc>
@@ -3526,7 +3526,7 @@
               <w:rPr>
                 <w:rFonts w:ascii="宋体" w:hAnsi="宋体" w:eastAsia="宋体"/>
               </w:rPr>
-              <w:t>深圳市同生咨询合伙企业（有限合伙）</w:t>
+              <w:t>鼎润数字科技（深圳）有限公司</w:t>
             </w:r>
           </w:p>
         </w:tc>
@@ -3539,7 +3539,7 @@
               <w:rPr>
                 <w:rFonts w:ascii="宋体" w:hAnsi="宋体" w:eastAsia="宋体"/>
               </w:rPr>
-              <w:t>实际控制人关系亲密的家庭成员控制的公司</w:t>
+              <w:t>实际控制人控制的公司</w:t>
             </w:r>
           </w:p>
         </w:tc>
@@ -3554,7 +3554,7 @@
               <w:rPr>
                 <w:rFonts w:ascii="宋体" w:hAnsi="宋体" w:eastAsia="宋体"/>
               </w:rPr>
-              <w:t>北京坤尚投资有限公司</w:t>
+              <w:t>三合数科（深圳）科技有限公司</w:t>
             </w:r>
           </w:p>
         </w:tc>
@@ -3567,7 +3567,7 @@
               <w:rPr>
                 <w:rFonts w:ascii="宋体" w:hAnsi="宋体" w:eastAsia="宋体"/>
               </w:rPr>
-              <w:t>实际控制人关系亲密的家庭成员控制的公司</w:t>
+              <w:t>实际控制人控制的公司</w:t>
             </w:r>
           </w:p>
         </w:tc>
@@ -3582,7 +3582,7 @@
               <w:rPr>
                 <w:rFonts w:ascii="宋体" w:hAnsi="宋体" w:eastAsia="宋体"/>
               </w:rPr>
-              <w:t>青岛保税港区中投汇通投资有限公司</w:t>
+              <w:t>深圳市驰安数科信息有限公司</w:t>
             </w:r>
           </w:p>
         </w:tc>
@@ -3595,91 +3595,7 @@
               <w:rPr>
                 <w:rFonts w:ascii="宋体" w:hAnsi="宋体" w:eastAsia="宋体"/>
               </w:rPr>
-              <w:t>实际控制人关系亲密的家庭成员控制的公司</w:t>
-            </w:r>
-          </w:p>
-        </w:tc>
-      </w:tr>
-      <w:tr>
-        <w:tc>
-          <w:tcPr>
-            <w:tcW w:type="dxa" w:w="4275"/>
-          </w:tcPr>
-          <w:p>
-            <w:r>
-              <w:rPr>
-                <w:rFonts w:ascii="宋体" w:hAnsi="宋体" w:eastAsia="宋体"/>
-              </w:rPr>
-              <w:t>满君文化传媒（北京）有限公司</w:t>
-            </w:r>
-          </w:p>
-        </w:tc>
-        <w:tc>
-          <w:tcPr>
-            <w:tcW w:type="dxa" w:w="4242"/>
-          </w:tcPr>
-          <w:p>
-            <w:r>
-              <w:rPr>
-                <w:rFonts w:ascii="宋体" w:hAnsi="宋体" w:eastAsia="宋体"/>
-              </w:rPr>
-              <w:t>实际控制人关系亲密的家庭成员控制的公司</w:t>
-            </w:r>
-          </w:p>
-        </w:tc>
-      </w:tr>
-      <w:tr>
-        <w:tc>
-          <w:tcPr>
-            <w:tcW w:type="dxa" w:w="4275"/>
-          </w:tcPr>
-          <w:p>
-            <w:r>
-              <w:rPr>
-                <w:rFonts w:ascii="宋体" w:hAnsi="宋体" w:eastAsia="宋体"/>
-              </w:rPr>
-              <w:t>深圳市宏达诚供应链管理有限公司</w:t>
-            </w:r>
-          </w:p>
-        </w:tc>
-        <w:tc>
-          <w:tcPr>
-            <w:tcW w:type="dxa" w:w="4242"/>
-          </w:tcPr>
-          <w:p>
-            <w:r>
-              <w:rPr>
-                <w:rFonts w:ascii="宋体" w:hAnsi="宋体" w:eastAsia="宋体"/>
-              </w:rPr>
-              <w:t>实际控制人关系亲密的家庭成员控制的公司</w:t>
-            </w:r>
-          </w:p>
-        </w:tc>
-      </w:tr>
-      <w:tr>
-        <w:tc>
-          <w:tcPr>
-            <w:tcW w:type="dxa" w:w="4275"/>
-          </w:tcPr>
-          <w:p>
-            <w:r>
-              <w:rPr>
-                <w:rFonts w:ascii="宋体" w:hAnsi="宋体" w:eastAsia="宋体"/>
-              </w:rPr>
-              <w:t>深圳市裕禾明境实业管理有限公司</w:t>
-            </w:r>
-          </w:p>
-        </w:tc>
-        <w:tc>
-          <w:tcPr>
-            <w:tcW w:type="dxa" w:w="4242"/>
-          </w:tcPr>
-          <w:p>
-            <w:r>
-              <w:rPr>
-                <w:rFonts w:ascii="宋体" w:hAnsi="宋体" w:eastAsia="宋体"/>
-              </w:rPr>
-              <w:t>实际控制人关系亲密的家庭成员控制的公司</w:t>
+              <w:t>实际控制人控制的公司</w:t>
             </w:r>
           </w:p>
         </w:tc>

</xml_diff>